<commit_message>
Actualizar la propuesta de KAPILARI con soporte mensual.
Quita el lenguaje que cerraba el crecimiento del sitio y agrega la mensualidad: 150.000 para la página corporativa y 250.000 para la tienda, con tope de 50 productos al mes.

Co-authored-by: Jhon123Javier <Jhon123Javier@users.noreply.github.com>
</commit_message>
<xml_diff>
--- a/documentos/kapilari/Propuesta The Company Dev - KAPILARI - Pagina Corporativa o Tienda Virtual.docx
+++ b/documentos/kapilari/Propuesta The Company Dev - KAPILARI - Pagina Corporativa o Tienda Virtual.docx
@@ -172,7 +172,7 @@
           <w:color w:val="1B3325"/>
           <w:sz w:val="26"/>
         </w:rPr>
-        <w:t xml:space="preserve"> elige una sola opción. No son etapas que se hagan una después de la otra, y esta propuesta no incluye plan de crecimiento ni administración mensual.</w:t>
+        <w:t xml:space="preserve"> puede empezar por la página corporativa o por la tienda virtual. El sitio queda listo para crecer: más adelante puede pedir la otra opción, funciones nuevas o la mensualidad de soporte.</w:t>
       </w:r>
     </w:p>
     <w:p>
@@ -600,7 +600,47 @@
           <w:color w:val="1B3325"/>
           <w:sz w:val="26"/>
         </w:rPr>
-        <w:t>La tienda permite publicar el catálogo, armar el pedido y gestionarlo desde un panel. La pasarela de pago no está incluida.</w:t>
+        <w:t xml:space="preserve">La tienda permite publicar el catálogo, armar el pedido y gestionarlo desde un panel. Queda lista para conectar una pasarela de pago. El costo de la pasarela lo asume </w:t>
+      </w:r>
+      <w:r>
+        <w:rPr>
+          <w:rFonts w:ascii="Poppins" w:hAnsi="Poppins" w:cs="Poppins" w:eastAsia="Poppins"/>
+          <w:b/>
+          <w:i w:val="0"/>
+          <w:color w:val="1B3325"/>
+          <w:sz w:val="26"/>
+        </w:rPr>
+        <w:t>EL CLIENTE</w:t>
+      </w:r>
+      <w:r>
+        <w:rPr>
+          <w:rFonts w:ascii="Poppins" w:hAnsi="Poppins" w:cs="Poppins" w:eastAsia="Poppins"/>
+          <w:b w:val="0"/>
+          <w:i w:val="0"/>
+          <w:color w:val="1B3325"/>
+          <w:sz w:val="26"/>
+        </w:rPr>
+        <w:t xml:space="preserve">. Cuando KAPILARI quiera activarla, </w:t>
+      </w:r>
+      <w:r>
+        <w:rPr>
+          <w:rFonts w:ascii="Poppins" w:hAnsi="Poppins" w:cs="Poppins" w:eastAsia="Poppins"/>
+          <w:b/>
+          <w:i w:val="0"/>
+          <w:color w:val="1B3325"/>
+          <w:sz w:val="26"/>
+        </w:rPr>
+        <w:t>THE COMPANY DEV</w:t>
+      </w:r>
+      <w:r>
+        <w:rPr>
+          <w:rFonts w:ascii="Poppins" w:hAnsi="Poppins" w:cs="Poppins" w:eastAsia="Poppins"/>
+          <w:b w:val="0"/>
+          <w:i w:val="0"/>
+          <w:color w:val="1B3325"/>
+          <w:sz w:val="26"/>
+        </w:rPr>
+        <w:t xml:space="preserve"> hace la conexión.</w:t>
       </w:r>
     </w:p>
     <w:p>
@@ -748,7 +788,7 @@
           <w:color w:val="1B3325"/>
           <w:sz w:val="26"/>
         </w:rPr>
-        <w:t>Blog, listo para publicar. La redacción de artículos no está incluida.</w:t>
+        <w:t>Blog listo para publicar. KAPILARI entrega los textos y, con la mensualidad, se publican y se optimizan para SEO.</w:t>
       </w:r>
     </w:p>
     <w:p>
@@ -1290,7 +1330,27 @@
           <w:color w:val="1B3325"/>
           <w:sz w:val="26"/>
         </w:rPr>
-        <w:t>Integración con pasarela de pago. La pasarela no está incluida en este valor.</w:t>
+        <w:t xml:space="preserve">Conexión con pasarela de pago cuando KAPILARI la tenga. El costo de la pasarela lo asume </w:t>
+      </w:r>
+      <w:r>
+        <w:rPr>
+          <w:rFonts w:ascii="Poppins" w:hAnsi="Poppins" w:cs="Poppins" w:eastAsia="Poppins"/>
+          <w:b/>
+          <w:i w:val="0"/>
+          <w:color w:val="1B3325"/>
+          <w:sz w:val="26"/>
+        </w:rPr>
+        <w:t>EL CLIENTE</w:t>
+      </w:r>
+      <w:r>
+        <w:rPr>
+          <w:rFonts w:ascii="Poppins" w:hAnsi="Poppins" w:cs="Poppins" w:eastAsia="Poppins"/>
+          <w:b w:val="0"/>
+          <w:i w:val="0"/>
+          <w:color w:val="1B3325"/>
+          <w:sz w:val="26"/>
+        </w:rPr>
+        <w:t>.</w:t>
       </w:r>
     </w:p>
     <w:p>
@@ -1990,7 +2050,27 @@
           <w:color w:val="1B3325"/>
           <w:sz w:val="26"/>
         </w:rPr>
-        <w:t>La administración mensual, el mantenimiento continuo, las copias de seguridad periódicas y el plan de crecimiento no están incluidos.</w:t>
+        <w:t xml:space="preserve">Al entregar el sitio, KAPILARI puede seguir con la mensualidad de soporte. Ahí van el mantenimiento, las copias de seguridad, el blog, el </w:t>
+      </w:r>
+      <w:r>
+        <w:rPr>
+          <w:rFonts w:ascii="Poppins" w:hAnsi="Poppins" w:cs="Poppins" w:eastAsia="Poppins"/>
+          <w:b/>
+          <w:i w:val="0"/>
+          <w:color w:val="1B3325"/>
+          <w:sz w:val="26"/>
+        </w:rPr>
+        <w:t>SEO</w:t>
+      </w:r>
+      <w:r>
+        <w:rPr>
+          <w:rFonts w:ascii="Poppins" w:hAnsi="Poppins" w:cs="Poppins" w:eastAsia="Poppins"/>
+          <w:b w:val="0"/>
+          <w:i w:val="0"/>
+          <w:color w:val="1B3325"/>
+          <w:sz w:val="26"/>
+        </w:rPr>
+        <w:t xml:space="preserve"> y, en la tienda, la subida de productos. El detalle y los valores están al final de esta propuesta.</w:t>
       </w:r>
     </w:p>
     <w:p>
@@ -3159,7 +3239,27 @@
           <w:color w:val="1B3325"/>
           <w:sz w:val="26"/>
         </w:rPr>
-        <w:t>Lo que no esté escrito en esta propuesta se cotiza aparte.</w:t>
+        <w:t xml:space="preserve">Si KAPILARI necesita algo más después de la entrega, lo pide y </w:t>
+      </w:r>
+      <w:r>
+        <w:rPr>
+          <w:rFonts w:ascii="Poppins" w:hAnsi="Poppins" w:cs="Poppins" w:eastAsia="Poppins"/>
+          <w:b/>
+          <w:i w:val="0"/>
+          <w:color w:val="1B3325"/>
+          <w:sz w:val="26"/>
+        </w:rPr>
+        <w:t>THE COMPANY DEV</w:t>
+      </w:r>
+      <w:r>
+        <w:rPr>
+          <w:rFonts w:ascii="Poppins" w:hAnsi="Poppins" w:cs="Poppins" w:eastAsia="Poppins"/>
+          <w:b w:val="0"/>
+          <w:i w:val="0"/>
+          <w:color w:val="1B3325"/>
+          <w:sz w:val="26"/>
+        </w:rPr>
+        <w:t xml:space="preserve"> lo cotiza. El sitio puede seguir creciendo.</w:t>
       </w:r>
     </w:p>
     <w:p>
@@ -3263,25 +3363,17 @@
           <w:color w:val="1B3325"/>
           <w:sz w:val="26"/>
         </w:rPr>
-        <w:t>Los cambios de estructura pedidos después de aprobar el diseño pueden tener un costo adicional.</w:t>
+        <w:t xml:space="preserve">Si después de aprobar el diseño KAPILARI pide un cambio de estructura, </w:t>
       </w:r>
-    </w:p>
-    <w:p>
-      <w:pPr>
-        <w:spacing w:before="20" w:after="40" w:line="259" w:lineRule="auto"/>
-        <w:ind w:left="425" w:hanging="227"/>
-        <w:jc w:val="left"/>
-        <w:widowControl/>
-      </w:pPr>
       <w:r>
         <w:rPr>
           <w:rFonts w:ascii="Poppins" w:hAnsi="Poppins" w:cs="Poppins" w:eastAsia="Poppins"/>
-          <w:b w:val="0"/>
+          <w:b/>
           <w:i w:val="0"/>
           <w:color w:val="1B3325"/>
           <w:sz w:val="26"/>
         </w:rPr>
-        <w:t xml:space="preserve">•  </w:t>
+        <w:t>THE COMPANY DEV</w:t>
       </w:r>
       <w:r>
         <w:rPr>
@@ -3291,7 +3383,7 @@
           <w:color w:val="1B3325"/>
           <w:sz w:val="26"/>
         </w:rPr>
-        <w:t>Esta propuesta no incluye plan de crecimiento, administración mensual ni mantenimiento continuo.</w:t>
+        <w:t xml:space="preserve"> lo revisa y lo cotiza.</w:t>
       </w:r>
     </w:p>
     <w:p>
@@ -3329,7 +3421,7 @@
           <w:color w:val="1B3325"/>
           <w:sz w:val="26"/>
         </w:rPr>
-        <w:t xml:space="preserve"> elige la Opción A o la Opción B. Los dos valores no se suman, porque no se contratan las dos opciones dentro de esta propuesta.</w:t>
+        <w:t xml:space="preserve"> puede empezar por la Opción A o por la Opción B. Más adelante puede pedir la otra opción o funciones nuevas, y ese trabajo se cotiza cuando lo solicite.</w:t>
       </w:r>
     </w:p>
     <w:p>
@@ -3625,7 +3717,27 @@
           <w:color w:val="1B3325"/>
           <w:sz w:val="26"/>
         </w:rPr>
-        <w:t xml:space="preserve">El hosting y el dominio no están incluidos en estos valores. Si KAPILARI no los tiene, </w:t>
+        <w:t xml:space="preserve">El hosting y el dominio los paga </w:t>
+      </w:r>
+      <w:r>
+        <w:rPr>
+          <w:rFonts w:ascii="Poppins" w:hAnsi="Poppins" w:cs="Poppins" w:eastAsia="Poppins"/>
+          <w:b/>
+          <w:i w:val="0"/>
+          <w:color w:val="1B3325"/>
+          <w:sz w:val="26"/>
+        </w:rPr>
+        <w:t>EL CLIENTE</w:t>
+      </w:r>
+      <w:r>
+        <w:rPr>
+          <w:rFonts w:ascii="Poppins" w:hAnsi="Poppins" w:cs="Poppins" w:eastAsia="Poppins"/>
+          <w:b w:val="0"/>
+          <w:i w:val="0"/>
+          <w:color w:val="1B3325"/>
+          <w:sz w:val="26"/>
+        </w:rPr>
+        <w:t xml:space="preserve">. Si KAPILARI no los tiene, </w:t>
       </w:r>
       <w:r>
         <w:rPr>
@@ -3645,7 +3757,7 @@
           <w:color w:val="1B3325"/>
           <w:sz w:val="26"/>
         </w:rPr>
-        <w:t xml:space="preserve"> indica cómo adquirirlos. La renovación anual queda a cargo de </w:t>
+        <w:t xml:space="preserve"> indica cómo adquirirlos. La renovación anual también queda a cargo de </w:t>
       </w:r>
       <w:r>
         <w:rPr>
@@ -3788,6 +3900,968 @@
     </w:p>
     <w:p>
       <w:pPr>
+        <w:spacing w:before="240" w:after="80" w:line="259" w:lineRule="auto"/>
+        <w:jc w:val="left"/>
+        <w:keepNext/>
+        <w:widowControl/>
+      </w:pPr>
+      <w:r>
+        <w:rPr>
+          <w:rFonts w:ascii="Poppins" w:hAnsi="Poppins" w:cs="Poppins" w:eastAsia="Poppins"/>
+          <w:b/>
+          <w:i w:val="0"/>
+          <w:color w:val="1B3325"/>
+          <w:sz w:val="26"/>
+        </w:rPr>
+        <w:t>7. Mensualidad de soporte</w:t>
+      </w:r>
+    </w:p>
+    <w:p>
+      <w:pPr>
+        <w:spacing w:before="0" w:after="160" w:line="259" w:lineRule="auto"/>
+        <w:jc w:val="both"/>
+        <w:widowControl/>
+      </w:pPr>
+      <w:r>
+        <w:rPr>
+          <w:rFonts w:ascii="Poppins" w:hAnsi="Poppins" w:cs="Poppins" w:eastAsia="Poppins"/>
+          <w:b w:val="0"/>
+          <w:i w:val="0"/>
+          <w:color w:val="1B3325"/>
+          <w:sz w:val="26"/>
+        </w:rPr>
+        <w:t xml:space="preserve">La mensualidad empieza después de publicar el sitio. Es el acompañamiento para que la página siga al día y pueda crecer. </w:t>
+      </w:r>
+      <w:r>
+        <w:rPr>
+          <w:rFonts w:ascii="Poppins" w:hAnsi="Poppins" w:cs="Poppins" w:eastAsia="Poppins"/>
+          <w:b/>
+          <w:i w:val="0"/>
+          <w:color w:val="1B3325"/>
+          <w:sz w:val="26"/>
+        </w:rPr>
+        <w:t>EL CLIENTE</w:t>
+      </w:r>
+      <w:r>
+        <w:rPr>
+          <w:rFonts w:ascii="Poppins" w:hAnsi="Poppins" w:cs="Poppins" w:eastAsia="Poppins"/>
+          <w:b w:val="0"/>
+          <w:i w:val="0"/>
+          <w:color w:val="1B3325"/>
+          <w:sz w:val="26"/>
+        </w:rPr>
+        <w:t xml:space="preserve"> la toma según la opción que tenga. Si un mes necesita más de lo que cubre el plan, lo pide y </w:t>
+      </w:r>
+      <w:r>
+        <w:rPr>
+          <w:rFonts w:ascii="Poppins" w:hAnsi="Poppins" w:cs="Poppins" w:eastAsia="Poppins"/>
+          <w:b/>
+          <w:i w:val="0"/>
+          <w:color w:val="1B3325"/>
+          <w:sz w:val="26"/>
+        </w:rPr>
+        <w:t>THE COMPANY DEV</w:t>
+      </w:r>
+      <w:r>
+        <w:rPr>
+          <w:rFonts w:ascii="Poppins" w:hAnsi="Poppins" w:cs="Poppins" w:eastAsia="Poppins"/>
+          <w:b w:val="0"/>
+          <w:i w:val="0"/>
+          <w:color w:val="1B3325"/>
+          <w:sz w:val="26"/>
+        </w:rPr>
+        <w:t xml:space="preserve"> lo cotiza.</w:t>
+      </w:r>
+    </w:p>
+    <w:p>
+      <w:pPr>
+        <w:spacing w:before="160" w:after="40" w:line="259" w:lineRule="auto"/>
+        <w:jc w:val="left"/>
+        <w:keepNext/>
+        <w:widowControl/>
+      </w:pPr>
+      <w:r>
+        <w:rPr>
+          <w:rFonts w:ascii="Poppins" w:hAnsi="Poppins" w:cs="Poppins" w:eastAsia="Poppins"/>
+          <w:b/>
+          <w:i w:val="0"/>
+          <w:color w:val="1B3325"/>
+          <w:sz w:val="26"/>
+        </w:rPr>
+        <w:t>Página corporativa</w:t>
+      </w:r>
+    </w:p>
+    <w:p>
+      <w:pPr>
+        <w:spacing w:before="40" w:after="80" w:line="259" w:lineRule="auto"/>
+        <w:jc w:val="both"/>
+        <w:widowControl/>
+      </w:pPr>
+      <w:r>
+        <w:rPr>
+          <w:rFonts w:ascii="Poppins" w:hAnsi="Poppins" w:cs="Poppins" w:eastAsia="Poppins"/>
+          <w:b w:val="0"/>
+          <w:i w:val="0"/>
+          <w:color w:val="1B3325"/>
+          <w:sz w:val="26"/>
+        </w:rPr>
+        <w:t xml:space="preserve">Valor: </w:t>
+      </w:r>
+      <w:r>
+        <w:rPr>
+          <w:rFonts w:ascii="Poppins" w:hAnsi="Poppins" w:cs="Poppins" w:eastAsia="Poppins"/>
+          <w:b/>
+          <w:i w:val="0"/>
+          <w:color w:val="1B3325"/>
+          <w:sz w:val="26"/>
+        </w:rPr>
+        <w:t>$150.000 COP al mes.</w:t>
+      </w:r>
+    </w:p>
+    <w:p>
+      <w:pPr>
+        <w:spacing w:before="0" w:after="40" w:line="259" w:lineRule="auto"/>
+        <w:jc w:val="both"/>
+        <w:keepNext/>
+        <w:widowControl/>
+      </w:pPr>
+      <w:r>
+        <w:rPr>
+          <w:rFonts w:ascii="Poppins" w:hAnsi="Poppins" w:cs="Poppins" w:eastAsia="Poppins"/>
+          <w:b w:val="0"/>
+          <w:i w:val="0"/>
+          <w:color w:val="1B3325"/>
+          <w:sz w:val="26"/>
+        </w:rPr>
+        <w:t>Cada mes incluye:</w:t>
+      </w:r>
+    </w:p>
+    <w:p>
+      <w:pPr>
+        <w:spacing w:before="20" w:after="40" w:line="259" w:lineRule="auto"/>
+        <w:ind w:left="425" w:hanging="227"/>
+        <w:jc w:val="left"/>
+        <w:widowControl/>
+      </w:pPr>
+      <w:r>
+        <w:rPr>
+          <w:rFonts w:ascii="Poppins" w:hAnsi="Poppins" w:cs="Poppins" w:eastAsia="Poppins"/>
+          <w:b w:val="0"/>
+          <w:i w:val="0"/>
+          <w:color w:val="1B3325"/>
+          <w:sz w:val="26"/>
+        </w:rPr>
+        <w:t xml:space="preserve">•  </w:t>
+      </w:r>
+      <w:r>
+        <w:rPr>
+          <w:rFonts w:ascii="Poppins" w:hAnsi="Poppins" w:cs="Poppins" w:eastAsia="Poppins"/>
+          <w:b w:val="0"/>
+          <w:i w:val="0"/>
+          <w:color w:val="1B3325"/>
+          <w:sz w:val="26"/>
+        </w:rPr>
+        <w:t>Mantenimiento técnico del sitio: revisión de carga, enlaces, formulario y panel.</w:t>
+      </w:r>
+    </w:p>
+    <w:p>
+      <w:pPr>
+        <w:spacing w:before="20" w:after="40" w:line="259" w:lineRule="auto"/>
+        <w:ind w:left="425" w:hanging="227"/>
+        <w:jc w:val="left"/>
+        <w:widowControl/>
+      </w:pPr>
+      <w:r>
+        <w:rPr>
+          <w:rFonts w:ascii="Poppins" w:hAnsi="Poppins" w:cs="Poppins" w:eastAsia="Poppins"/>
+          <w:b w:val="0"/>
+          <w:i w:val="0"/>
+          <w:color w:val="1B3325"/>
+          <w:sz w:val="26"/>
+        </w:rPr>
+        <w:t xml:space="preserve">•  </w:t>
+      </w:r>
+      <w:r>
+        <w:rPr>
+          <w:rFonts w:ascii="Poppins" w:hAnsi="Poppins" w:cs="Poppins" w:eastAsia="Poppins"/>
+          <w:b w:val="0"/>
+          <w:i w:val="0"/>
+          <w:color w:val="1B3325"/>
+          <w:sz w:val="26"/>
+        </w:rPr>
+        <w:t>Revisión de que se vea bien en celular y en computador.</w:t>
+      </w:r>
+    </w:p>
+    <w:p>
+      <w:pPr>
+        <w:spacing w:before="20" w:after="40" w:line="259" w:lineRule="auto"/>
+        <w:ind w:left="425" w:hanging="227"/>
+        <w:jc w:val="left"/>
+        <w:widowControl/>
+      </w:pPr>
+      <w:r>
+        <w:rPr>
+          <w:rFonts w:ascii="Poppins" w:hAnsi="Poppins" w:cs="Poppins" w:eastAsia="Poppins"/>
+          <w:b w:val="0"/>
+          <w:i w:val="0"/>
+          <w:color w:val="1B3325"/>
+          <w:sz w:val="26"/>
+        </w:rPr>
+        <w:t xml:space="preserve">•  </w:t>
+      </w:r>
+      <w:r>
+        <w:rPr>
+          <w:rFonts w:ascii="Poppins" w:hAnsi="Poppins" w:cs="Poppins" w:eastAsia="Poppins"/>
+          <w:b w:val="0"/>
+          <w:i w:val="0"/>
+          <w:color w:val="1B3325"/>
+          <w:sz w:val="26"/>
+        </w:rPr>
+        <w:t>Revisión de WhatsApp, redes sociales y mapa.</w:t>
+      </w:r>
+    </w:p>
+    <w:p>
+      <w:pPr>
+        <w:spacing w:before="20" w:after="40" w:line="259" w:lineRule="auto"/>
+        <w:ind w:left="425" w:hanging="227"/>
+        <w:jc w:val="left"/>
+        <w:widowControl/>
+      </w:pPr>
+      <w:r>
+        <w:rPr>
+          <w:rFonts w:ascii="Poppins" w:hAnsi="Poppins" w:cs="Poppins" w:eastAsia="Poppins"/>
+          <w:b w:val="0"/>
+          <w:i w:val="0"/>
+          <w:color w:val="1B3325"/>
+          <w:sz w:val="26"/>
+        </w:rPr>
+        <w:t xml:space="preserve">•  </w:t>
+      </w:r>
+      <w:r>
+        <w:rPr>
+          <w:rFonts w:ascii="Poppins" w:hAnsi="Poppins" w:cs="Poppins" w:eastAsia="Poppins"/>
+          <w:b w:val="0"/>
+          <w:i w:val="0"/>
+          <w:color w:val="1B3325"/>
+          <w:sz w:val="26"/>
+        </w:rPr>
+        <w:t>Actualizaciones de seguridad de la plataforma.</w:t>
+      </w:r>
+    </w:p>
+    <w:p>
+      <w:pPr>
+        <w:spacing w:before="20" w:after="40" w:line="259" w:lineRule="auto"/>
+        <w:ind w:left="425" w:hanging="227"/>
+        <w:jc w:val="left"/>
+        <w:widowControl/>
+      </w:pPr>
+      <w:r>
+        <w:rPr>
+          <w:rFonts w:ascii="Poppins" w:hAnsi="Poppins" w:cs="Poppins" w:eastAsia="Poppins"/>
+          <w:b w:val="0"/>
+          <w:i w:val="0"/>
+          <w:color w:val="1B3325"/>
+          <w:sz w:val="26"/>
+        </w:rPr>
+        <w:t xml:space="preserve">•  </w:t>
+      </w:r>
+      <w:r>
+        <w:rPr>
+          <w:rFonts w:ascii="Poppins" w:hAnsi="Poppins" w:cs="Poppins" w:eastAsia="Poppins"/>
+          <w:b w:val="0"/>
+          <w:i w:val="0"/>
+          <w:color w:val="1B3325"/>
+          <w:sz w:val="26"/>
+        </w:rPr>
+        <w:t>Copia de seguridad del sitio y resguardo para restaurarlo si hace falta.</w:t>
+      </w:r>
+    </w:p>
+    <w:p>
+      <w:pPr>
+        <w:spacing w:before="20" w:after="40" w:line="259" w:lineRule="auto"/>
+        <w:ind w:left="425" w:hanging="227"/>
+        <w:jc w:val="left"/>
+        <w:widowControl/>
+      </w:pPr>
+      <w:r>
+        <w:rPr>
+          <w:rFonts w:ascii="Poppins" w:hAnsi="Poppins" w:cs="Poppins" w:eastAsia="Poppins"/>
+          <w:b w:val="0"/>
+          <w:i w:val="0"/>
+          <w:color w:val="1B3325"/>
+          <w:sz w:val="26"/>
+        </w:rPr>
+        <w:t xml:space="preserve">•  </w:t>
+      </w:r>
+      <w:r>
+        <w:rPr>
+          <w:rFonts w:ascii="Poppins" w:hAnsi="Poppins" w:cs="Poppins" w:eastAsia="Poppins"/>
+          <w:b w:val="0"/>
+          <w:i w:val="0"/>
+          <w:color w:val="1B3325"/>
+          <w:sz w:val="26"/>
+        </w:rPr>
+        <w:t>Publicación en el blog de los textos y las imágenes que entregue KAPILARI.</w:t>
+      </w:r>
+    </w:p>
+    <w:p>
+      <w:pPr>
+        <w:spacing w:before="20" w:after="40" w:line="259" w:lineRule="auto"/>
+        <w:ind w:left="425" w:hanging="227"/>
+        <w:jc w:val="left"/>
+        <w:widowControl/>
+      </w:pPr>
+      <w:r>
+        <w:rPr>
+          <w:rFonts w:ascii="Poppins" w:hAnsi="Poppins" w:cs="Poppins" w:eastAsia="Poppins"/>
+          <w:b w:val="0"/>
+          <w:i w:val="0"/>
+          <w:color w:val="1B3325"/>
+          <w:sz w:val="26"/>
+        </w:rPr>
+        <w:t xml:space="preserve">•  </w:t>
+      </w:r>
+      <w:r>
+        <w:rPr>
+          <w:rFonts w:ascii="Poppins" w:hAnsi="Poppins" w:cs="Poppins" w:eastAsia="Poppins"/>
+          <w:b w:val="0"/>
+          <w:i w:val="0"/>
+          <w:color w:val="1B3325"/>
+          <w:sz w:val="26"/>
+        </w:rPr>
+        <w:t xml:space="preserve">Optimización </w:t>
+      </w:r>
+      <w:r>
+        <w:rPr>
+          <w:rFonts w:ascii="Poppins" w:hAnsi="Poppins" w:cs="Poppins" w:eastAsia="Poppins"/>
+          <w:b/>
+          <w:i w:val="0"/>
+          <w:color w:val="1B3325"/>
+          <w:sz w:val="26"/>
+        </w:rPr>
+        <w:t>SEO</w:t>
+      </w:r>
+      <w:r>
+        <w:rPr>
+          <w:rFonts w:ascii="Poppins" w:hAnsi="Poppins" w:cs="Poppins" w:eastAsia="Poppins"/>
+          <w:b w:val="0"/>
+          <w:i w:val="0"/>
+          <w:color w:val="1B3325"/>
+          <w:sz w:val="26"/>
+        </w:rPr>
+        <w:t xml:space="preserve"> de cada entrada: título, descripción, enlace y estructura.</w:t>
+      </w:r>
+    </w:p>
+    <w:p>
+      <w:pPr>
+        <w:spacing w:before="20" w:after="40" w:line="259" w:lineRule="auto"/>
+        <w:ind w:left="425" w:hanging="227"/>
+        <w:jc w:val="left"/>
+        <w:widowControl/>
+      </w:pPr>
+      <w:r>
+        <w:rPr>
+          <w:rFonts w:ascii="Poppins" w:hAnsi="Poppins" w:cs="Poppins" w:eastAsia="Poppins"/>
+          <w:b w:val="0"/>
+          <w:i w:val="0"/>
+          <w:color w:val="1B3325"/>
+          <w:sz w:val="26"/>
+        </w:rPr>
+        <w:t xml:space="preserve">•  </w:t>
+      </w:r>
+      <w:r>
+        <w:rPr>
+          <w:rFonts w:ascii="Poppins" w:hAnsi="Poppins" w:cs="Poppins" w:eastAsia="Poppins"/>
+          <w:b w:val="0"/>
+          <w:i w:val="0"/>
+          <w:color w:val="1B3325"/>
+          <w:sz w:val="26"/>
+        </w:rPr>
+        <w:t xml:space="preserve">Revisión </w:t>
+      </w:r>
+      <w:r>
+        <w:rPr>
+          <w:rFonts w:ascii="Poppins" w:hAnsi="Poppins" w:cs="Poppins" w:eastAsia="Poppins"/>
+          <w:b/>
+          <w:i w:val="0"/>
+          <w:color w:val="1B3325"/>
+          <w:sz w:val="26"/>
+        </w:rPr>
+        <w:t>SEO</w:t>
+      </w:r>
+      <w:r>
+        <w:rPr>
+          <w:rFonts w:ascii="Poppins" w:hAnsi="Poppins" w:cs="Poppins" w:eastAsia="Poppins"/>
+          <w:b w:val="0"/>
+          <w:i w:val="0"/>
+          <w:color w:val="1B3325"/>
+          <w:sz w:val="26"/>
+        </w:rPr>
+        <w:t xml:space="preserve"> básica de las páginas principales.</w:t>
+      </w:r>
+    </w:p>
+    <w:p>
+      <w:pPr>
+        <w:spacing w:before="20" w:after="40" w:line="259" w:lineRule="auto"/>
+        <w:ind w:left="425" w:hanging="227"/>
+        <w:jc w:val="left"/>
+        <w:widowControl/>
+      </w:pPr>
+      <w:r>
+        <w:rPr>
+          <w:rFonts w:ascii="Poppins" w:hAnsi="Poppins" w:cs="Poppins" w:eastAsia="Poppins"/>
+          <w:b w:val="0"/>
+          <w:i w:val="0"/>
+          <w:color w:val="1B3325"/>
+          <w:sz w:val="26"/>
+        </w:rPr>
+        <w:t xml:space="preserve">•  </w:t>
+      </w:r>
+      <w:r>
+        <w:rPr>
+          <w:rFonts w:ascii="Poppins" w:hAnsi="Poppins" w:cs="Poppins" w:eastAsia="Poppins"/>
+          <w:b w:val="0"/>
+          <w:i w:val="0"/>
+          <w:color w:val="1B3325"/>
+          <w:sz w:val="26"/>
+        </w:rPr>
+        <w:t>Cambios menores de textos e imágenes en las páginas que ya existen.</w:t>
+      </w:r>
+    </w:p>
+    <w:p>
+      <w:pPr>
+        <w:spacing w:before="20" w:after="40" w:line="259" w:lineRule="auto"/>
+        <w:ind w:left="425" w:hanging="227"/>
+        <w:jc w:val="left"/>
+        <w:widowControl/>
+      </w:pPr>
+      <w:r>
+        <w:rPr>
+          <w:rFonts w:ascii="Poppins" w:hAnsi="Poppins" w:cs="Poppins" w:eastAsia="Poppins"/>
+          <w:b w:val="0"/>
+          <w:i w:val="0"/>
+          <w:color w:val="1B3325"/>
+          <w:sz w:val="26"/>
+        </w:rPr>
+        <w:t xml:space="preserve">•  </w:t>
+      </w:r>
+      <w:r>
+        <w:rPr>
+          <w:rFonts w:ascii="Poppins" w:hAnsi="Poppins" w:cs="Poppins" w:eastAsia="Poppins"/>
+          <w:b w:val="0"/>
+          <w:i w:val="0"/>
+          <w:color w:val="1B3325"/>
+          <w:sz w:val="26"/>
+        </w:rPr>
+        <w:t>Atención por WhatsApp y correo, de lunes a viernes, de 9:00 a.m. a 5:00 p.m. Respuesta máxima: 24 horas hábiles.</w:t>
+      </w:r>
+    </w:p>
+    <w:p>
+      <w:pPr>
+        <w:spacing w:before="160" w:after="40" w:line="259" w:lineRule="auto"/>
+        <w:jc w:val="left"/>
+        <w:keepNext/>
+        <w:widowControl/>
+      </w:pPr>
+      <w:r>
+        <w:rPr>
+          <w:rFonts w:ascii="Poppins" w:hAnsi="Poppins" w:cs="Poppins" w:eastAsia="Poppins"/>
+          <w:b/>
+          <w:i w:val="0"/>
+          <w:color w:val="1B3325"/>
+          <w:sz w:val="26"/>
+        </w:rPr>
+        <w:t>Tienda virtual</w:t>
+      </w:r>
+    </w:p>
+    <w:p>
+      <w:pPr>
+        <w:spacing w:before="40" w:after="80" w:line="259" w:lineRule="auto"/>
+        <w:jc w:val="both"/>
+        <w:widowControl/>
+      </w:pPr>
+      <w:r>
+        <w:rPr>
+          <w:rFonts w:ascii="Poppins" w:hAnsi="Poppins" w:cs="Poppins" w:eastAsia="Poppins"/>
+          <w:b w:val="0"/>
+          <w:i w:val="0"/>
+          <w:color w:val="1B3325"/>
+          <w:sz w:val="26"/>
+        </w:rPr>
+        <w:t xml:space="preserve">Valor: </w:t>
+      </w:r>
+      <w:r>
+        <w:rPr>
+          <w:rFonts w:ascii="Poppins" w:hAnsi="Poppins" w:cs="Poppins" w:eastAsia="Poppins"/>
+          <w:b/>
+          <w:i w:val="0"/>
+          <w:color w:val="1B3325"/>
+          <w:sz w:val="26"/>
+        </w:rPr>
+        <w:t>$250.000 COP al mes.</w:t>
+      </w:r>
+      <w:r>
+        <w:rPr>
+          <w:rFonts w:ascii="Poppins" w:hAnsi="Poppins" w:cs="Poppins" w:eastAsia="Poppins"/>
+          <w:b w:val="0"/>
+          <w:i w:val="0"/>
+          <w:color w:val="1B3325"/>
+          <w:sz w:val="26"/>
+        </w:rPr>
+        <w:t xml:space="preserve"> Tope: </w:t>
+      </w:r>
+      <w:r>
+        <w:rPr>
+          <w:rFonts w:ascii="Poppins" w:hAnsi="Poppins" w:cs="Poppins" w:eastAsia="Poppins"/>
+          <w:b/>
+          <w:i w:val="0"/>
+          <w:color w:val="1B3325"/>
+          <w:sz w:val="26"/>
+        </w:rPr>
+        <w:t>50 productos al mes.</w:t>
+      </w:r>
+    </w:p>
+    <w:p>
+      <w:pPr>
+        <w:spacing w:before="0" w:after="40" w:line="259" w:lineRule="auto"/>
+        <w:jc w:val="both"/>
+        <w:keepNext/>
+        <w:widowControl/>
+      </w:pPr>
+      <w:r>
+        <w:rPr>
+          <w:rFonts w:ascii="Poppins" w:hAnsi="Poppins" w:cs="Poppins" w:eastAsia="Poppins"/>
+          <w:b w:val="0"/>
+          <w:i w:val="0"/>
+          <w:color w:val="1B3325"/>
+          <w:sz w:val="26"/>
+        </w:rPr>
+        <w:t>Incluye todo el cuidado de la página corporativa, aplicado a la tienda, y además el trabajo del catálogo:</w:t>
+      </w:r>
+    </w:p>
+    <w:p>
+      <w:pPr>
+        <w:spacing w:before="20" w:after="40" w:line="259" w:lineRule="auto"/>
+        <w:ind w:left="425" w:hanging="227"/>
+        <w:jc w:val="left"/>
+        <w:widowControl/>
+      </w:pPr>
+      <w:r>
+        <w:rPr>
+          <w:rFonts w:ascii="Poppins" w:hAnsi="Poppins" w:cs="Poppins" w:eastAsia="Poppins"/>
+          <w:b w:val="0"/>
+          <w:i w:val="0"/>
+          <w:color w:val="1B3325"/>
+          <w:sz w:val="26"/>
+        </w:rPr>
+        <w:t xml:space="preserve">•  </w:t>
+      </w:r>
+      <w:r>
+        <w:rPr>
+          <w:rFonts w:ascii="Poppins" w:hAnsi="Poppins" w:cs="Poppins" w:eastAsia="Poppins"/>
+          <w:b w:val="0"/>
+          <w:i w:val="0"/>
+          <w:color w:val="1B3325"/>
+          <w:sz w:val="26"/>
+        </w:rPr>
+        <w:t>Mantenimiento técnico de la tienda: carga, enlaces, panel, carrito y checkout.</w:t>
+      </w:r>
+    </w:p>
+    <w:p>
+      <w:pPr>
+        <w:spacing w:before="20" w:after="40" w:line="259" w:lineRule="auto"/>
+        <w:ind w:left="425" w:hanging="227"/>
+        <w:jc w:val="left"/>
+        <w:widowControl/>
+      </w:pPr>
+      <w:r>
+        <w:rPr>
+          <w:rFonts w:ascii="Poppins" w:hAnsi="Poppins" w:cs="Poppins" w:eastAsia="Poppins"/>
+          <w:b w:val="0"/>
+          <w:i w:val="0"/>
+          <w:color w:val="1B3325"/>
+          <w:sz w:val="26"/>
+        </w:rPr>
+        <w:t xml:space="preserve">•  </w:t>
+      </w:r>
+      <w:r>
+        <w:rPr>
+          <w:rFonts w:ascii="Poppins" w:hAnsi="Poppins" w:cs="Poppins" w:eastAsia="Poppins"/>
+          <w:b w:val="0"/>
+          <w:i w:val="0"/>
+          <w:color w:val="1B3325"/>
+          <w:sz w:val="26"/>
+        </w:rPr>
+        <w:t>Revisión en celular y en computador.</w:t>
+      </w:r>
+    </w:p>
+    <w:p>
+      <w:pPr>
+        <w:spacing w:before="20" w:after="40" w:line="259" w:lineRule="auto"/>
+        <w:ind w:left="425" w:hanging="227"/>
+        <w:jc w:val="left"/>
+        <w:widowControl/>
+      </w:pPr>
+      <w:r>
+        <w:rPr>
+          <w:rFonts w:ascii="Poppins" w:hAnsi="Poppins" w:cs="Poppins" w:eastAsia="Poppins"/>
+          <w:b w:val="0"/>
+          <w:i w:val="0"/>
+          <w:color w:val="1B3325"/>
+          <w:sz w:val="26"/>
+        </w:rPr>
+        <w:t xml:space="preserve">•  </w:t>
+      </w:r>
+      <w:r>
+        <w:rPr>
+          <w:rFonts w:ascii="Poppins" w:hAnsi="Poppins" w:cs="Poppins" w:eastAsia="Poppins"/>
+          <w:b w:val="0"/>
+          <w:i w:val="0"/>
+          <w:color w:val="1B3325"/>
+          <w:sz w:val="26"/>
+        </w:rPr>
+        <w:t>Revisión de WhatsApp, redes y métodos de envío.</w:t>
+      </w:r>
+    </w:p>
+    <w:p>
+      <w:pPr>
+        <w:spacing w:before="20" w:after="40" w:line="259" w:lineRule="auto"/>
+        <w:ind w:left="425" w:hanging="227"/>
+        <w:jc w:val="left"/>
+        <w:widowControl/>
+      </w:pPr>
+      <w:r>
+        <w:rPr>
+          <w:rFonts w:ascii="Poppins" w:hAnsi="Poppins" w:cs="Poppins" w:eastAsia="Poppins"/>
+          <w:b w:val="0"/>
+          <w:i w:val="0"/>
+          <w:color w:val="1B3325"/>
+          <w:sz w:val="26"/>
+        </w:rPr>
+        <w:t xml:space="preserve">•  </w:t>
+      </w:r>
+      <w:r>
+        <w:rPr>
+          <w:rFonts w:ascii="Poppins" w:hAnsi="Poppins" w:cs="Poppins" w:eastAsia="Poppins"/>
+          <w:b w:val="0"/>
+          <w:i w:val="0"/>
+          <w:color w:val="1B3325"/>
+          <w:sz w:val="26"/>
+        </w:rPr>
+        <w:t>Actualizaciones de seguridad de la plataforma.</w:t>
+      </w:r>
+    </w:p>
+    <w:p>
+      <w:pPr>
+        <w:spacing w:before="20" w:after="40" w:line="259" w:lineRule="auto"/>
+        <w:ind w:left="425" w:hanging="227"/>
+        <w:jc w:val="left"/>
+        <w:widowControl/>
+      </w:pPr>
+      <w:r>
+        <w:rPr>
+          <w:rFonts w:ascii="Poppins" w:hAnsi="Poppins" w:cs="Poppins" w:eastAsia="Poppins"/>
+          <w:b w:val="0"/>
+          <w:i w:val="0"/>
+          <w:color w:val="1B3325"/>
+          <w:sz w:val="26"/>
+        </w:rPr>
+        <w:t xml:space="preserve">•  </w:t>
+      </w:r>
+      <w:r>
+        <w:rPr>
+          <w:rFonts w:ascii="Poppins" w:hAnsi="Poppins" w:cs="Poppins" w:eastAsia="Poppins"/>
+          <w:b w:val="0"/>
+          <w:i w:val="0"/>
+          <w:color w:val="1B3325"/>
+          <w:sz w:val="26"/>
+        </w:rPr>
+        <w:t>Copia de seguridad de la tienda y resguardo para restaurarla si hace falta.</w:t>
+      </w:r>
+    </w:p>
+    <w:p>
+      <w:pPr>
+        <w:spacing w:before="20" w:after="40" w:line="259" w:lineRule="auto"/>
+        <w:ind w:left="425" w:hanging="227"/>
+        <w:jc w:val="left"/>
+        <w:widowControl/>
+      </w:pPr>
+      <w:r>
+        <w:rPr>
+          <w:rFonts w:ascii="Poppins" w:hAnsi="Poppins" w:cs="Poppins" w:eastAsia="Poppins"/>
+          <w:b w:val="0"/>
+          <w:i w:val="0"/>
+          <w:color w:val="1B3325"/>
+          <w:sz w:val="26"/>
+        </w:rPr>
+        <w:t xml:space="preserve">•  </w:t>
+      </w:r>
+      <w:r>
+        <w:rPr>
+          <w:rFonts w:ascii="Poppins" w:hAnsi="Poppins" w:cs="Poppins" w:eastAsia="Poppins"/>
+          <w:b w:val="0"/>
+          <w:i w:val="0"/>
+          <w:color w:val="1B3325"/>
+          <w:sz w:val="26"/>
+        </w:rPr>
+        <w:t>Publicación en el blog de los textos y las imágenes que entregue KAPILARI.</w:t>
+      </w:r>
+    </w:p>
+    <w:p>
+      <w:pPr>
+        <w:spacing w:before="20" w:after="40" w:line="259" w:lineRule="auto"/>
+        <w:ind w:left="425" w:hanging="227"/>
+        <w:jc w:val="left"/>
+        <w:widowControl/>
+      </w:pPr>
+      <w:r>
+        <w:rPr>
+          <w:rFonts w:ascii="Poppins" w:hAnsi="Poppins" w:cs="Poppins" w:eastAsia="Poppins"/>
+          <w:b w:val="0"/>
+          <w:i w:val="0"/>
+          <w:color w:val="1B3325"/>
+          <w:sz w:val="26"/>
+        </w:rPr>
+        <w:t xml:space="preserve">•  </w:t>
+      </w:r>
+      <w:r>
+        <w:rPr>
+          <w:rFonts w:ascii="Poppins" w:hAnsi="Poppins" w:cs="Poppins" w:eastAsia="Poppins"/>
+          <w:b w:val="0"/>
+          <w:i w:val="0"/>
+          <w:color w:val="1B3325"/>
+          <w:sz w:val="26"/>
+        </w:rPr>
+        <w:t xml:space="preserve">Optimización </w:t>
+      </w:r>
+      <w:r>
+        <w:rPr>
+          <w:rFonts w:ascii="Poppins" w:hAnsi="Poppins" w:cs="Poppins" w:eastAsia="Poppins"/>
+          <w:b/>
+          <w:i w:val="0"/>
+          <w:color w:val="1B3325"/>
+          <w:sz w:val="26"/>
+        </w:rPr>
+        <w:t>SEO</w:t>
+      </w:r>
+      <w:r>
+        <w:rPr>
+          <w:rFonts w:ascii="Poppins" w:hAnsi="Poppins" w:cs="Poppins" w:eastAsia="Poppins"/>
+          <w:b w:val="0"/>
+          <w:i w:val="0"/>
+          <w:color w:val="1B3325"/>
+          <w:sz w:val="26"/>
+        </w:rPr>
+        <w:t xml:space="preserve"> de cada entrada y revisión </w:t>
+      </w:r>
+      <w:r>
+        <w:rPr>
+          <w:rFonts w:ascii="Poppins" w:hAnsi="Poppins" w:cs="Poppins" w:eastAsia="Poppins"/>
+          <w:b/>
+          <w:i w:val="0"/>
+          <w:color w:val="1B3325"/>
+          <w:sz w:val="26"/>
+        </w:rPr>
+        <w:t>SEO</w:t>
+      </w:r>
+      <w:r>
+        <w:rPr>
+          <w:rFonts w:ascii="Poppins" w:hAnsi="Poppins" w:cs="Poppins" w:eastAsia="Poppins"/>
+          <w:b w:val="0"/>
+          <w:i w:val="0"/>
+          <w:color w:val="1B3325"/>
+          <w:sz w:val="26"/>
+        </w:rPr>
+        <w:t xml:space="preserve"> básica de las páginas principales.</w:t>
+      </w:r>
+    </w:p>
+    <w:p>
+      <w:pPr>
+        <w:spacing w:before="20" w:after="40" w:line="259" w:lineRule="auto"/>
+        <w:ind w:left="425" w:hanging="227"/>
+        <w:jc w:val="left"/>
+        <w:widowControl/>
+      </w:pPr>
+      <w:r>
+        <w:rPr>
+          <w:rFonts w:ascii="Poppins" w:hAnsi="Poppins" w:cs="Poppins" w:eastAsia="Poppins"/>
+          <w:b w:val="0"/>
+          <w:i w:val="0"/>
+          <w:color w:val="1B3325"/>
+          <w:sz w:val="26"/>
+        </w:rPr>
+        <w:t xml:space="preserve">•  </w:t>
+      </w:r>
+      <w:r>
+        <w:rPr>
+          <w:rFonts w:ascii="Poppins" w:hAnsi="Poppins" w:cs="Poppins" w:eastAsia="Poppins"/>
+          <w:b w:val="0"/>
+          <w:i w:val="0"/>
+          <w:color w:val="1B3325"/>
+          <w:sz w:val="26"/>
+        </w:rPr>
+        <w:t>Cambios menores de textos e imágenes en las páginas que ya existen.</w:t>
+      </w:r>
+    </w:p>
+    <w:p>
+      <w:pPr>
+        <w:spacing w:before="20" w:after="40" w:line="259" w:lineRule="auto"/>
+        <w:ind w:left="425" w:hanging="227"/>
+        <w:jc w:val="left"/>
+        <w:widowControl/>
+      </w:pPr>
+      <w:r>
+        <w:rPr>
+          <w:rFonts w:ascii="Poppins" w:hAnsi="Poppins" w:cs="Poppins" w:eastAsia="Poppins"/>
+          <w:b w:val="0"/>
+          <w:i w:val="0"/>
+          <w:color w:val="1B3325"/>
+          <w:sz w:val="26"/>
+        </w:rPr>
+        <w:t xml:space="preserve">•  </w:t>
+      </w:r>
+      <w:r>
+        <w:rPr>
+          <w:rFonts w:ascii="Poppins" w:hAnsi="Poppins" w:cs="Poppins" w:eastAsia="Poppins"/>
+          <w:b w:val="0"/>
+          <w:i w:val="0"/>
+          <w:color w:val="1B3325"/>
+          <w:sz w:val="26"/>
+        </w:rPr>
+        <w:t>Subida de hasta 50 productos en el mes. Cada uno lleva la foto, el nombre, la descripción, la categoría y el precio que entregue KAPILARI.</w:t>
+      </w:r>
+    </w:p>
+    <w:p>
+      <w:pPr>
+        <w:spacing w:before="20" w:after="40" w:line="259" w:lineRule="auto"/>
+        <w:ind w:left="425" w:hanging="227"/>
+        <w:jc w:val="left"/>
+        <w:widowControl/>
+      </w:pPr>
+      <w:r>
+        <w:rPr>
+          <w:rFonts w:ascii="Poppins" w:hAnsi="Poppins" w:cs="Poppins" w:eastAsia="Poppins"/>
+          <w:b w:val="0"/>
+          <w:i w:val="0"/>
+          <w:color w:val="1B3325"/>
+          <w:sz w:val="26"/>
+        </w:rPr>
+        <w:t xml:space="preserve">•  </w:t>
+      </w:r>
+      <w:r>
+        <w:rPr>
+          <w:rFonts w:ascii="Poppins" w:hAnsi="Poppins" w:cs="Poppins" w:eastAsia="Poppins"/>
+          <w:b w:val="0"/>
+          <w:i w:val="0"/>
+          <w:color w:val="1B3325"/>
+          <w:sz w:val="26"/>
+        </w:rPr>
+        <w:t>Variantes del producto, cuando KAPILARI las entregue junto con la ficha.</w:t>
+      </w:r>
+    </w:p>
+    <w:p>
+      <w:pPr>
+        <w:spacing w:before="20" w:after="40" w:line="259" w:lineRule="auto"/>
+        <w:ind w:left="425" w:hanging="227"/>
+        <w:jc w:val="left"/>
+        <w:widowControl/>
+      </w:pPr>
+      <w:r>
+        <w:rPr>
+          <w:rFonts w:ascii="Poppins" w:hAnsi="Poppins" w:cs="Poppins" w:eastAsia="Poppins"/>
+          <w:b w:val="0"/>
+          <w:i w:val="0"/>
+          <w:color w:val="1B3325"/>
+          <w:sz w:val="26"/>
+        </w:rPr>
+        <w:t xml:space="preserve">•  </w:t>
+      </w:r>
+      <w:r>
+        <w:rPr>
+          <w:rFonts w:ascii="Poppins" w:hAnsi="Poppins" w:cs="Poppins" w:eastAsia="Poppins"/>
+          <w:b w:val="0"/>
+          <w:i w:val="0"/>
+          <w:color w:val="1B3325"/>
+          <w:sz w:val="26"/>
+        </w:rPr>
+        <w:t>Actualización de precios e inventario de esos productos.</w:t>
+      </w:r>
+    </w:p>
+    <w:p>
+      <w:pPr>
+        <w:spacing w:before="20" w:after="40" w:line="259" w:lineRule="auto"/>
+        <w:ind w:left="425" w:hanging="227"/>
+        <w:jc w:val="left"/>
+        <w:widowControl/>
+      </w:pPr>
+      <w:r>
+        <w:rPr>
+          <w:rFonts w:ascii="Poppins" w:hAnsi="Poppins" w:cs="Poppins" w:eastAsia="Poppins"/>
+          <w:b w:val="0"/>
+          <w:i w:val="0"/>
+          <w:color w:val="1B3325"/>
+          <w:sz w:val="26"/>
+        </w:rPr>
+        <w:t xml:space="preserve">•  </w:t>
+      </w:r>
+      <w:r>
+        <w:rPr>
+          <w:rFonts w:ascii="Poppins" w:hAnsi="Poppins" w:cs="Poppins" w:eastAsia="Poppins"/>
+          <w:b w:val="0"/>
+          <w:i w:val="0"/>
+          <w:color w:val="1B3325"/>
+          <w:sz w:val="26"/>
+        </w:rPr>
+        <w:t>Orden de las categorías del catálogo.</w:t>
+      </w:r>
+    </w:p>
+    <w:p>
+      <w:pPr>
+        <w:spacing w:before="20" w:after="40" w:line="259" w:lineRule="auto"/>
+        <w:ind w:left="425" w:hanging="227"/>
+        <w:jc w:val="left"/>
+        <w:widowControl/>
+      </w:pPr>
+      <w:r>
+        <w:rPr>
+          <w:rFonts w:ascii="Poppins" w:hAnsi="Poppins" w:cs="Poppins" w:eastAsia="Poppins"/>
+          <w:b w:val="0"/>
+          <w:i w:val="0"/>
+          <w:color w:val="1B3325"/>
+          <w:sz w:val="26"/>
+        </w:rPr>
+        <w:t xml:space="preserve">•  </w:t>
+      </w:r>
+      <w:r>
+        <w:rPr>
+          <w:rFonts w:ascii="Poppins" w:hAnsi="Poppins" w:cs="Poppins" w:eastAsia="Poppins"/>
+          <w:b w:val="0"/>
+          <w:i w:val="0"/>
+          <w:color w:val="1B3325"/>
+          <w:sz w:val="26"/>
+        </w:rPr>
+        <w:t>Atención por WhatsApp y correo, de lunes a viernes, de 9:00 a.m. a 5:00 p.m. Respuesta máxima: 24 horas hábiles.</w:t>
+      </w:r>
+    </w:p>
+    <w:p>
+      <w:pPr>
+        <w:spacing w:before="80" w:after="160" w:line="259" w:lineRule="auto"/>
+        <w:jc w:val="both"/>
+        <w:widowControl/>
+      </w:pPr>
+      <w:r>
+        <w:rPr>
+          <w:rFonts w:ascii="Poppins" w:hAnsi="Poppins" w:cs="Poppins" w:eastAsia="Poppins"/>
+          <w:b w:val="0"/>
+          <w:i w:val="0"/>
+          <w:color w:val="1B3325"/>
+          <w:sz w:val="26"/>
+        </w:rPr>
+        <w:t>Si en un mes hacen falta más de 50 productos, o KAPILARI pide una sección o una función nueva, ese trabajo se cotiza en ese momento. La tienda que ya está publicada sigue igual y puede seguir creciendo.</w:t>
+      </w:r>
+    </w:p>
+    <w:p>
+      <w:pPr>
         <w:spacing w:before="160" w:after="160" w:line="259" w:lineRule="auto"/>
         <w:jc w:val="both"/>
         <w:widowControl/>
@@ -3800,7 +4874,7 @@
           <w:color w:val="1B3325"/>
           <w:sz w:val="26"/>
         </w:rPr>
-        <w:t>Quedo atento para revisar con KAPILARI cuál de las dos opciones se ajusta a lo que necesita y dejar la fecha de inicio.</w:t>
+        <w:t>Quedo atento para revisar con KAPILARI por dónde empezar y dejar la fecha de inicio.</w:t>
       </w:r>
     </w:p>
     <w:tbl>
@@ -3927,7 +5001,7 @@
     </w:tbl>
     <w:p>
       <w:pPr>
-        <w:spacing w:before="4000" w:after="0" w:line="259" w:lineRule="auto"/>
+        <w:spacing w:before="280" w:after="0" w:line="259" w:lineRule="auto"/>
         <w:jc w:val="right"/>
         <w:widowControl/>
         <w:keepNext/>

</xml_diff>